<commit_message>
Add user registration and authentication check functionality
- Created auth_check.php to verify user session and redirect if not authenticated.
- Added registrerAccTemp.php for user registration form.
- Implemented registrer_acc_temp_confirm.php to handle form submission and store user data in the database.
</commit_message>
<xml_diff>
--- a/Details/Kravspesifikasjon.docx
+++ b/Details/Kravspesifikasjon.docx
@@ -98,7 +98,7 @@
     </w:p>
     <w:tbl>
       <w:tblPr>
-        <w:tblStyle w:val="TableGrid"/>
+        <w:tblStyle w:val="Tabellrutenett"/>
         <w:tblW w:w="0" w:type="auto"/>
         <w:tblLook w:val="04A0" w:firstRow="1" w:lastRow="0" w:firstColumn="1" w:lastColumn="0" w:noHBand="0" w:noVBand="1"/>
       </w:tblPr>
@@ -697,6 +697,22 @@
                 <w:szCs w:val="24"/>
               </w:rPr>
             </w:pPr>
+            <w:r>
+              <w:rPr>
+                <w:sz w:val="24"/>
+                <w:szCs w:val="24"/>
+              </w:rPr>
+              <w:t xml:space="preserve">Logge in med </w:t>
+            </w:r>
+            <w:proofErr w:type="spellStart"/>
+            <w:r>
+              <w:rPr>
+                <w:sz w:val="24"/>
+                <w:szCs w:val="24"/>
+              </w:rPr>
+              <w:t>github</w:t>
+            </w:r>
+            <w:proofErr w:type="spellEnd"/>
           </w:p>
         </w:tc>
         <w:tc>
@@ -711,6 +727,13 @@
                 <w:szCs w:val="24"/>
               </w:rPr>
             </w:pPr>
+            <w:r>
+              <w:rPr>
+                <w:sz w:val="24"/>
+                <w:szCs w:val="24"/>
+              </w:rPr>
+              <w:t>3</w:t>
+            </w:r>
           </w:p>
         </w:tc>
       </w:tr>
@@ -1207,13 +1230,13 @@
     <w:name w:val="Normal"/>
     <w:qFormat/>
   </w:style>
-  <w:style w:type="character" w:default="1" w:styleId="DefaultParagraphFont">
+  <w:style w:type="character" w:default="1" w:styleId="Standardskriftforavsnitt">
     <w:name w:val="Default Paragraph Font"/>
     <w:uiPriority w:val="1"/>
     <w:semiHidden/>
     <w:unhideWhenUsed/>
   </w:style>
-  <w:style w:type="table" w:default="1" w:styleId="TableNormal">
+  <w:style w:type="table" w:default="1" w:styleId="Vanligtabell">
     <w:name w:val="Normal Table"/>
     <w:uiPriority w:val="99"/>
     <w:semiHidden/>
@@ -1228,15 +1251,15 @@
       </w:tblCellMar>
     </w:tblPr>
   </w:style>
-  <w:style w:type="numbering" w:default="1" w:styleId="NoList">
+  <w:style w:type="numbering" w:default="1" w:styleId="Ingenliste">
     <w:name w:val="No List"/>
     <w:uiPriority w:val="99"/>
     <w:semiHidden/>
     <w:unhideWhenUsed/>
   </w:style>
-  <w:style w:type="table" w:styleId="TableGrid">
+  <w:style w:type="table" w:styleId="Tabellrutenett">
     <w:name w:val="Table Grid"/>
-    <w:basedOn w:val="TableNormal"/>
+    <w:basedOn w:val="Vanligtabell"/>
     <w:uiPriority w:val="59"/>
     <w:rsid w:val="00245ABD"/>
     <w:pPr>
@@ -1542,12 +1565,11 @@
 </file>
 
 <file path=customXml/item1.xml><?xml version="1.0" encoding="utf-8"?>
-<?mso-contentType ?>
-<FormTemplates xmlns="http://schemas.microsoft.com/sharepoint/v3/contenttype/forms">
-  <Display>DocumentLibraryForm</Display>
-  <Edit>DocumentLibraryForm</Edit>
-  <New>DocumentLibraryForm</New>
-</FormTemplates>
+<p:properties xmlns:p="http://schemas.microsoft.com/office/2006/metadata/properties" xmlns:xsi="http://www.w3.org/2001/XMLSchema-instance" xmlns:pc="http://schemas.microsoft.com/office/infopath/2007/PartnerControls">
+  <documentManagement>
+    <ReferenceId xmlns="573b67d9-623f-491c-ad57-041053dc6ceb" xsi:nil="true"/>
+  </documentManagement>
+</p:properties>
 </file>
 
 <file path=customXml/item2.xml><?xml version="1.0" encoding="utf-8"?>
@@ -1695,17 +1717,20 @@
 </file>
 
 <file path=customXml/item3.xml><?xml version="1.0" encoding="utf-8"?>
-<p:properties xmlns:p="http://schemas.microsoft.com/office/2006/metadata/properties" xmlns:xsi="http://www.w3.org/2001/XMLSchema-instance" xmlns:pc="http://schemas.microsoft.com/office/infopath/2007/PartnerControls">
-  <documentManagement>
-    <ReferenceId xmlns="573b67d9-623f-491c-ad57-041053dc6ceb" xsi:nil="true"/>
-  </documentManagement>
-</p:properties>
+<?mso-contentType ?>
+<FormTemplates xmlns="http://schemas.microsoft.com/sharepoint/v3/contenttype/forms">
+  <Display>DocumentLibraryForm</Display>
+  <Edit>DocumentLibraryForm</Edit>
+  <New>DocumentLibraryForm</New>
+</FormTemplates>
 </file>
 
 <file path=customXml/itemProps1.xml><?xml version="1.0" encoding="utf-8"?>
-<ds:datastoreItem xmlns:ds="http://schemas.openxmlformats.org/officeDocument/2006/customXml" ds:itemID="{A2D87EAA-8424-41B7-9091-47E231C187E6}">
+<ds:datastoreItem xmlns:ds="http://schemas.openxmlformats.org/officeDocument/2006/customXml" ds:itemID="{A2D67DB8-5AA7-460C-AE6E-EE4EB1A4A69D}">
   <ds:schemaRefs>
-    <ds:schemaRef ds:uri="http://schemas.microsoft.com/sharepoint/v3/contenttype/forms"/>
+    <ds:schemaRef ds:uri="http://schemas.microsoft.com/office/2006/metadata/properties"/>
+    <ds:schemaRef ds:uri="http://schemas.microsoft.com/office/infopath/2007/PartnerControls"/>
+    <ds:schemaRef ds:uri="573b67d9-623f-491c-ad57-041053dc6ceb"/>
   </ds:schemaRefs>
 </ds:datastoreItem>
 </file>
@@ -1729,11 +1754,9 @@
 </file>
 
 <file path=customXml/itemProps3.xml><?xml version="1.0" encoding="utf-8"?>
-<ds:datastoreItem xmlns:ds="http://schemas.openxmlformats.org/officeDocument/2006/customXml" ds:itemID="{A2D67DB8-5AA7-460C-AE6E-EE4EB1A4A69D}">
+<ds:datastoreItem xmlns:ds="http://schemas.openxmlformats.org/officeDocument/2006/customXml" ds:itemID="{A2D87EAA-8424-41B7-9091-47E231C187E6}">
   <ds:schemaRefs>
-    <ds:schemaRef ds:uri="http://schemas.microsoft.com/office/2006/metadata/properties"/>
-    <ds:schemaRef ds:uri="http://schemas.microsoft.com/office/infopath/2007/PartnerControls"/>
-    <ds:schemaRef ds:uri="573b67d9-623f-491c-ad57-041053dc6ceb"/>
+    <ds:schemaRef ds:uri="http://schemas.microsoft.com/sharepoint/v3/contenttype/forms"/>
   </ds:schemaRefs>
 </ds:datastoreItem>
 </file>
</xml_diff>